<commit_message>
Unregister 加 -Cluster / -VMHost；多條件取交集；清單多記 VMHost / Cluster
- Unregister-VmFromOldVc.ps1：新增 -Cluster、-VMHost（連舊 vC 即時依 Runtime.Host 篩，
  VM 與範本一次涵蓋；Get-Template -Location 不接受 Cluster 所以走 view）。
  -Datastore / -Cluster / -VMHost / -Folder / -VM 同時給時取交集，畫面顯示 [a AND b]。
- Export-VcMeta.ps1：vm-placement.csv 多 VMHost、Cluster 兩欄。
- 實測（舊 vC DryRun）：-Cluster Cluster -Datastore ForNFS = 11 台（70 ∩ 11），
  開著的 9 台全部 SkippedPoweredOn；-VMHost 10.0.0.98 -Datastore pcssd1 = 4 台；
  不存在的叢集名 → 0 台並提示。
- README / docx 同步更新。

Co-Authored-By: Claude Opus 5 <noreply@anthropic.com>
</commit_message>
<xml_diff>
--- a/docs/vCenter跨站搬移工具-使用手冊與實測報告.docx
+++ b/docs/vCenter跨站搬移工具-使用手冊與實測報告.docx
@@ -3584,7 +3584,7 @@
                 <w:sz w:val="19"/>
                 <w:szCs w:val="19"/>
               </w:rPr>
-              <w:t xml:space="preserve">每台 VM / 範本在哪個資料夾；含 InstanceUuid、BiosUuid、IsTemplate、InVApp、VmPathName、PowerState</w:t>
+              <w:t xml:space="preserve">每台 VM / 範本在哪個資料夾；含 InstanceUuid、BiosUuid、IsTemplate、InVApp、VmPathName、PowerState、VMHost、Cluster</w:t>
             </w:r>
           </w:p>
         </w:tc>
@@ -4734,7 +4734,7 @@
           <w:sz w:val="20"/>
           <w:szCs w:val="20"/>
         </w:rPr>
-        <w:t xml:space="preserve">同名多台跳過（SkippedAmbiguous）；不接受「全部」，一定要給 -Datastore / -Folder / -VM 其中一個。</w:t>
+        <w:t xml:space="preserve">同名多台跳過（SkippedAmbiguous）；不接受「全部」，一定要給 -Datastore / -Cluster / -VMHost / -Folder / -VM 其中一個。</w:t>
       </w:r>
     </w:p>
     <w:p>

</xml_diff>

<commit_message>
docs：-Lun 與跨 datastore 警告補進 docx / PDF
Co-Authored-By: Claude Opus 5 <noreply@anthropic.com>
</commit_message>
<xml_diff>
--- a/docs/vCenter跨站搬移工具-使用手冊與實測報告.docx
+++ b/docs/vCenter跨站搬移工具-使用手冊與實測報告.docx
@@ -4439,7 +4439,57 @@
                 <w:sz w:val="19"/>
                 <w:szCs w:val="19"/>
               </w:rPr>
-              <w:t xml:space="preserve">清單裡 vmx 在這些 datastore 上的 VM</w:t>
+              <w:t xml:space="preserve">清單裡 vmx 在這些 datastore 上的 VM（= VM 的 home datastore）</w:t>
+            </w:r>
+          </w:p>
+        </w:tc>
+      </w:tr>
+      <w:tr>
+        <w:tc>
+          <w:tcPr>
+            <w:tcW w:type="dxa" w:w="2966"/>
+            <w:tcMar>
+              <w:top w:type="dxa" w:w="60"/>
+              <w:left w:type="dxa" w:w="90"/>
+              <w:bottom w:type="dxa" w:w="60"/>
+              <w:right w:type="dxa" w:w="90"/>
+            </w:tcMar>
+          </w:tcPr>
+          <w:p>
+            <w:pPr>
+              <w:spacing w:after="0"/>
+            </w:pPr>
+            <w:r>
+              <w:rPr>
+                <w:rFonts w:ascii="Microsoft JhengHei" w:cs="Microsoft JhengHei" w:eastAsia="Microsoft JhengHei" w:hAnsi="Microsoft JhengHei"/>
+                <w:sz w:val="19"/>
+                <w:szCs w:val="19"/>
+              </w:rPr>
+              <w:t xml:space="preserve">-Lun naa.6000… / 尾碼</w:t>
+            </w:r>
+          </w:p>
+        </w:tc>
+        <w:tc>
+          <w:tcPr>
+            <w:tcW w:type="dxa" w:w="6672"/>
+            <w:tcMar>
+              <w:top w:type="dxa" w:w="60"/>
+              <w:left w:type="dxa" w:w="90"/>
+              <w:bottom w:type="dxa" w:w="60"/>
+              <w:right w:type="dxa" w:w="90"/>
+            </w:tcMar>
+          </w:tcPr>
+          <w:p>
+            <w:pPr>
+              <w:spacing w:after="0"/>
+            </w:pPr>
+            <w:r>
+              <w:rPr>
+                <w:rFonts w:ascii="Microsoft JhengHei" w:cs="Microsoft JhengHei" w:eastAsia="Microsoft JhengHei" w:hAnsi="Microsoft JhengHei"/>
+                <w:sz w:val="19"/>
+                <w:szCs w:val="19"/>
+              </w:rPr>
+              <w:t xml:space="preserve">儲存端給的 LUN ID：用 VMFS extent 反查落在上面的 datastore，效果同 -Datastore</w:t>
             </w:r>
           </w:p>
         </w:tc>
@@ -4734,7 +4784,25 @@
           <w:sz w:val="20"/>
           <w:szCs w:val="20"/>
         </w:rPr>
-        <w:t xml:space="preserve">同名多台跳過（SkippedAmbiguous）；不接受「全部」，一定要給 -Datastore / -Cluster / -VMHost / -Folder / -VM 其中一個。</w:t>
+        <w:t xml:space="preserve">同名多台跳過（SkippedAmbiguous）；不接受「全部」，一定要給 -Datastore / -Lun / -Cluster / -VMHost / -Folder / -VM 其中一個。</w:t>
+      </w:r>
+    </w:p>
+    <w:p>
+      <w:pPr>
+        <w:pStyle w:val="ListParagraph"/>
+        <w:numPr>
+          <w:ilvl w:val="0"/>
+          <w:numId w:val="2"/>
+        </w:numPr>
+        <w:spacing w:after="60"/>
+      </w:pPr>
+      <w:r>
+        <w:rPr>
+          <w:rFonts w:ascii="Microsoft JhengHei" w:cs="Microsoft JhengHei" w:eastAsia="Microsoft JhengHei" w:hAnsi="Microsoft JhengHei"/>
+          <w:sz w:val="20"/>
+          <w:szCs w:val="20"/>
+        </w:rPr>
+        <w:t xml:space="preserve">跨 datastore 的 VM 只警告不擋：名單內有 vmdk 在別顆（WarnDiskElsewhere）、名單外卻有 vmdk 在這顆（WarnDiskOnDatastore）——只搬一顆 LUN 這兩種都會壞，先把碟搬齊或一起搬。</w:t>
       </w:r>
     </w:p>
     <w:p>

</xml_diff>